<commit_message>
fix: centralize study guide paths and propagate builder drill
</commit_message>
<xml_diff>
--- a/Study/Guides/Daily_Interview_Rehearsal_Workbook.docx
+++ b/Study/Guides/Daily_Interview_Rehearsal_Workbook.docx
@@ -4255,7 +4255,7 @@
           <w:color w:val="000000"/>
           <w:sz w:val="20"/>
         </w:rPr>
-        <w:t>at East West, high-volume inventory adjustments were manual and error-prone; you built an automated, auditable workflow and did the same for Approved Manufacturer List maintenance; cut manual work by 78 percent and inventory discrepancies by 22 percent, and added an audit trail.</w:t>
+        <w:t>at East West, high-volume inventory adjustments were manual and error-prone; you built an automated, auditable workflow and did the same for Approved Manufacturer List maintenance; cut manual work by 78 percent and inventory discrepancies by 22 percent, and added an audit trail. Builder use: the proof is the controlled, repeatable mechanism, not the size of the result alone.</w:t>
       </w:r>
     </w:p>
     <w:p>
@@ -6523,7 +6523,7 @@
           <w:color w:val="000000"/>
           <w:sz w:val="20"/>
         </w:rPr>
-        <w:t>at The Home Depot, as a founding pilot-team member, you helped stand up an internal SMS support channel that did not previously exist; you configured LivePerson LiveEngage chat and text workflows, automated greetings and closings, AI-assisted chatbot logic, and early channel-usage monitoring, and documented the setup so it could be repeated.</w:t>
+        <w:t>at The Home Depot, as a founding pilot-team member, you helped stand up an internal SMS support channel that did not previously exist; you configured LivePerson LiveEngage chat and text workflows, automated greetings and closings, AI-assisted chatbot logic, and early channel-usage monitoring, and documented the setup so it could be repeated. Builder use: explain the documented channel design that made the zero-to-one work reusable.</w:t>
       </w:r>
     </w:p>
     <w:p>
@@ -24043,7 +24043,7 @@
           <w:color w:val="000000"/>
           <w:sz w:val="20"/>
         </w:rPr>
-        <w:t>you turned business needs into backlog-ready requirements, coordinated UAT, and validated releases across Salesforce customer and marketing workflows, improving post-go-live follow-through and issue ownership. Covers product ownership, requirements discipline, and release coordination.</w:t>
+        <w:t>you turned business needs into backlog-ready requirements, coordinated UAT, and validated releases across Salesforce customer and marketing workflows, improving post-go-live follow-through and issue ownership. Covers product ownership, requirements discipline, and release coordination. Builder use: the reusable mechanism is intake, acceptance, validation, and release, not simply a completed Salesforce project.</w:t>
       </w:r>
     </w:p>
     <w:p>
@@ -27884,7 +27884,7 @@
           <w:color w:val="000000"/>
           <w:sz w:val="20"/>
         </w:rPr>
-        <w:t>Story 4 → Story 8 → Story 18 → Story 14 → Story 19 → Story 12</w:t>
+        <w:t>Story 4 → Story 8 → Story 18 → Story 14 → Story 19 → Story 5</w:t>
       </w:r>
     </w:p>
     <w:p>
@@ -28554,7 +28554,7 @@
           <w:color w:val="000000"/>
           <w:sz w:val="20"/>
         </w:rPr>
-        <w:t>Story 12 → Story 17 → Story 15 → Story 14 → Story 13 → Story 22</w:t>
+        <w:t>Story 12 → Story 17 → Story 15 → Story 14 → Story 13 → Story 20</w:t>
       </w:r>
     </w:p>
     <w:p>
@@ -29167,7 +29167,7 @@
       </w:r>
     </w:p>
     <w:p>
-      <w:bookmarkStart w:id="1956" w:name="competency_map"/>
+      <w:bookmarkStart w:id="1956" w:name="builder_drill"/>
       <w:pPr>
         <w:pStyle w:val="Heading1"/>
       </w:pPr>
@@ -29179,9 +29179,210 @@
           <w:color w:val="1F4E79"/>
           <w:sz w:val="34"/>
         </w:rPr>
+        <w:t>Builder / Repeatable Systems Drill</w:t>
+      </w:r>
+      <w:bookmarkEnd w:id="1956"/>
+    </w:p>
+    <w:p>
+      <w:pPr/>
+      <w:r>
+        <w:rPr>
+          <w:rFonts w:ascii="Aptos" w:hAnsi="Aptos"/>
+          <w:b/>
+          <w:i w:val="0"/>
+          <w:color w:val="1F4E79"/>
+          <w:sz w:val="20"/>
+        </w:rPr>
+        <w:t xml:space="preserve">Use when: </w:t>
+      </w:r>
+      <w:r>
+        <w:rPr>
+          <w:rFonts w:ascii="Aptos" w:hAnsi="Aptos"/>
+          <w:b w:val="0"/>
+          <w:i w:val="0"/>
+          <w:color w:val="000000"/>
+          <w:sz w:val="20"/>
+        </w:rPr>
+        <w:t>The posting asks for repeatability, scale, standardization, playbooks, documentation, enablement, workflow, or process design.</w:t>
+      </w:r>
+    </w:p>
+    <w:p>
+      <w:pPr/>
+      <w:r>
+        <w:rPr>
+          <w:rFonts w:ascii="Aptos" w:hAnsi="Aptos"/>
+          <w:b/>
+          <w:i w:val="0"/>
+          <w:color w:val="1F4E79"/>
+          <w:sz w:val="20"/>
+        </w:rPr>
+        <w:t xml:space="preserve">Do not claim: </w:t>
+      </w:r>
+      <w:r>
+        <w:rPr>
+          <w:rFonts w:ascii="Aptos" w:hAnsi="Aptos"/>
+          <w:b w:val="0"/>
+          <w:i w:val="0"/>
+          <w:color w:val="000000"/>
+          <w:sz w:val="20"/>
+        </w:rPr>
+        <w:t>A large number, dashboard, or completed project is not Builder proof by itself. Lead with the reusable mechanism.</w:t>
+      </w:r>
+    </w:p>
+    <w:p>
+      <w:pPr/>
+      <w:r>
+        <w:rPr>
+          <w:rFonts w:ascii="Aptos" w:hAnsi="Aptos"/>
+          <w:b/>
+          <w:i w:val="0"/>
+          <w:color w:val="1F4E79"/>
+          <w:sz w:val="20"/>
+        </w:rPr>
+        <w:t xml:space="preserve">Implementation and delivery: </w:t>
+      </w:r>
+      <w:r>
+        <w:rPr>
+          <w:rFonts w:ascii="Aptos" w:hAnsi="Aptos"/>
+          <w:b w:val="0"/>
+          <w:i w:val="0"/>
+          <w:color w:val="000000"/>
+          <w:sz w:val="20"/>
+        </w:rPr>
+        <w:t>Story 20: repeatable intake, acceptance, validation, and release discipline.</w:t>
+      </w:r>
+    </w:p>
+    <w:p>
+      <w:pPr/>
+      <w:r>
+        <w:rPr>
+          <w:rFonts w:ascii="Aptos" w:hAnsi="Aptos"/>
+          <w:b/>
+          <w:i w:val="0"/>
+          <w:color w:val="1F4E79"/>
+          <w:sz w:val="20"/>
+        </w:rPr>
+        <w:t xml:space="preserve">Customer Success: </w:t>
+      </w:r>
+      <w:r>
+        <w:rPr>
+          <w:rFonts w:ascii="Aptos" w:hAnsi="Aptos"/>
+          <w:b w:val="0"/>
+          <w:i w:val="0"/>
+          <w:color w:val="000000"/>
+          <w:sz w:val="20"/>
+        </w:rPr>
+        <w:t>Story 5: a documented zero-to-one channel that can be repeated; use the commercial boundary separately when asked.</w:t>
+      </w:r>
+    </w:p>
+    <w:p>
+      <w:pPr/>
+      <w:r>
+        <w:rPr>
+          <w:rFonts w:ascii="Aptos" w:hAnsi="Aptos"/>
+          <w:b/>
+          <w:i w:val="0"/>
+          <w:color w:val="1F4E79"/>
+          <w:sz w:val="20"/>
+        </w:rPr>
+        <w:t xml:space="preserve">Analytics and operations: </w:t>
+      </w:r>
+      <w:r>
+        <w:rPr>
+          <w:rFonts w:ascii="Aptos" w:hAnsi="Aptos"/>
+          <w:b w:val="0"/>
+          <w:i w:val="0"/>
+          <w:color w:val="000000"/>
+          <w:sz w:val="20"/>
+        </w:rPr>
+        <w:t>Story 3: an automated, auditable process with controlled repeatability.</w:t>
+      </w:r>
+    </w:p>
+    <w:p>
+      <w:pPr/>
+      <w:r>
+        <w:rPr>
+          <w:rFonts w:ascii="Aptos" w:hAnsi="Aptos"/>
+          <w:b/>
+          <w:i w:val="0"/>
+          <w:color w:val="1F4E79"/>
+          <w:sz w:val="20"/>
+        </w:rPr>
+        <w:t xml:space="preserve">Solutions consulting and pre-sales: </w:t>
+      </w:r>
+      <w:r>
+        <w:rPr>
+          <w:rFonts w:ascii="Aptos" w:hAnsi="Aptos"/>
+          <w:b w:val="0"/>
+          <w:i w:val="0"/>
+          <w:color w:val="000000"/>
+          <w:sz w:val="20"/>
+        </w:rPr>
+        <w:t>Story 20: translate requests into a repeatable request-to-release mechanism.</w:t>
+      </w:r>
+    </w:p>
+    <w:p>
+      <w:pPr/>
+      <w:r>
+        <w:rPr>
+          <w:rFonts w:ascii="Aptos" w:hAnsi="Aptos"/>
+          <w:b/>
+          <w:i w:val="0"/>
+          <w:color w:val="1F4E79"/>
+          <w:sz w:val="20"/>
+        </w:rPr>
+        <w:t xml:space="preserve">Change enablement and process improvement: </w:t>
+      </w:r>
+      <w:r>
+        <w:rPr>
+          <w:rFonts w:ascii="Aptos" w:hAnsi="Aptos"/>
+          <w:b w:val="0"/>
+          <w:i w:val="0"/>
+          <w:color w:val="000000"/>
+          <w:sz w:val="20"/>
+        </w:rPr>
+        <w:t>Story 5 for documented enablement/channel design or Story 3 for an auditable process.</w:t>
+      </w:r>
+    </w:p>
+    <w:p>
+      <w:pPr/>
+      <w:r>
+        <w:rPr>
+          <w:rFonts w:ascii="Aptos" w:hAnsi="Aptos"/>
+          <w:b/>
+          <w:i w:val="0"/>
+          <w:color w:val="1F4E79"/>
+          <w:sz w:val="20"/>
+        </w:rPr>
+        <w:t xml:space="preserve">CS commercial boundary: </w:t>
+      </w:r>
+      <w:r>
+        <w:rPr>
+          <w:rFonts w:ascii="Aptos" w:hAnsi="Aptos"/>
+          <w:b w:val="0"/>
+          <w:i w:val="0"/>
+          <w:color w:val="000000"/>
+          <w:sz w:val="20"/>
+        </w:rPr>
+        <w:t>I did not carry a quota or own NRR/GRR attainment or closed expansion dollars; I owned at-risk recovery, QBRs and executive reviews, and expansion discovery.</w:t>
+      </w:r>
+    </w:p>
+    <w:p>
+      <w:bookmarkStart w:id="1965" w:name="competency_map"/>
+      <w:pPr>
+        <w:pStyle w:val="Heading1"/>
+      </w:pPr>
+      <w:r>
+        <w:rPr>
+          <w:rFonts w:ascii="Aptos" w:hAnsi="Aptos"/>
+          <w:b/>
+          <w:i w:val="0"/>
+          <w:color w:val="1F4E79"/>
+          <w:sz w:val="34"/>
+        </w:rPr>
         <w:t>Competency Coverage Map</w:t>
       </w:r>
-      <w:bookmarkEnd w:id="1956"/>
+      <w:bookmarkEnd w:id="1965"/>
     </w:p>
     <w:tbl>
       <w:tblPr>
@@ -30059,7 +30260,7 @@
       </w:tr>
     </w:tbl>
     <w:p>
-      <w:bookmarkStart w:id="1957" w:name="rep_log"/>
+      <w:bookmarkStart w:id="1966" w:name="rep_log"/>
       <w:pPr>
         <w:pStyle w:val="Heading1"/>
       </w:pPr>
@@ -30073,7 +30274,7 @@
         </w:rPr>
         <w:t>Rep Log</w:t>
       </w:r>
-      <w:bookmarkEnd w:id="1957"/>
+      <w:bookmarkEnd w:id="1966"/>
     </w:p>
     <w:p>
       <w:pPr/>
@@ -31498,7 +31699,7 @@
       </w:r>
     </w:p>
     <w:p>
-      <w:bookmarkStart w:id="1960" w:name="clean_reference"/>
+      <w:bookmarkStart w:id="1969" w:name="clean_reference"/>
       <w:pPr>
         <w:pStyle w:val="Heading1"/>
       </w:pPr>
@@ -31512,7 +31713,7 @@
         </w:rPr>
         <w:t>Part 4: Clean 22-Story Reference</w:t>
       </w:r>
-      <w:bookmarkEnd w:id="1960"/>
+      <w:bookmarkEnd w:id="1969"/>
     </w:p>
     <w:p>
       <w:r>
@@ -33946,1093 +34147,6 @@
           <w:sz w:val="18"/>
         </w:rPr>
         <w:t>A: My ramp plan is to learn the product and customer workflow together, build a question and terminology map, shadow the highest-value conversations, and take ownership of increasingly complete work. I would measure ramp by the quality of my decisions and follow-through, not just by how much documentation I read.</w:t>
-      </w:r>
-    </w:p>
-    <w:p>
-      <w:pPr>
-        <w:pStyle w:val="Heading1"/>
-      </w:pPr>
-      <w:r>
-        <w:br w:type="page"/>
-      </w:r>
-      <w:r>
-        <w:rPr>
-          <w:rFonts w:ascii="Aptos" w:hAnsi="Aptos"/>
-          <w:b/>
-          <w:i w:val="0"/>
-          <w:color w:val="1F4E79"/>
-          <w:sz w:val="34"/>
-        </w:rPr>
-        <w:t xml:space="preserve">Part 3: Mock Question Bank (prompt to story)</w:t>
-      </w:r>
-    </w:p>
-    <w:p>
-      <w:pPr>
-        <w:spacing w:after="80"/>
-      </w:pPr>
-      <w:r>
-        <w:rPr>
-          <w:rFonts w:ascii="Aptos" w:hAnsi="Aptos"/>
-          <w:b w:val="0"/>
-          <w:i/>
-          <w:color w:val="5B6573"/>
-          <w:sz w:val="19"/>
-        </w:rPr>
-        <w:t xml:space="preserve">Cover the card, read the prompt aloud, name the story before you look. Selection under pressure is the exact skill that cost you the Procare screen. Reps here fix it.</w:t>
-      </w:r>
-    </w:p>
-    <w:p>
-      <w:pPr>
-        <w:pStyle w:val="Heading3"/>
-      </w:pPr>
-      <w:r>
-        <w:rPr>
-          <w:rFonts w:ascii="Aptos" w:hAnsi="Aptos"/>
-          <w:b/>
-          <w:i w:val="0"/>
-          <w:color w:val="1F4E79"/>
-          <w:sz w:val="22"/>
-        </w:rPr>
-        <w:t xml:space="preserve">Leadership and ownership</w:t>
-      </w:r>
-    </w:p>
-    <w:p>
-      <w:pPr>
-        <w:spacing w:after="80"/>
-      </w:pPr>
-      <w:r>
-        <w:rPr>
-          <w:rFonts w:ascii="Aptos" w:hAnsi="Aptos"/>
-          <w:b/>
-          <w:i w:val="0"/>
-          <w:color w:val="000000"/>
-          <w:sz w:val="19"/>
-        </w:rPr>
-        <w:t xml:space="preserve">•  Tell me about a time you led a project end to end.  </w:t>
-      </w:r>
-      <w:r>
-        <w:rPr>
-          <w:rFonts w:ascii="Aptos" w:hAnsi="Aptos"/>
-          <w:b w:val="0"/>
-          <w:i w:val="0"/>
-          <w:color w:val="2F75B5"/>
-          <w:sz w:val="19"/>
-        </w:rPr>
-        <w:t xml:space="preserve">→ East West end-to-end ERP implementation</w:t>
-      </w:r>
-    </w:p>
-    <w:p>
-      <w:pPr>
-        <w:spacing w:after="80"/>
-      </w:pPr>
-      <w:r>
-        <w:rPr>
-          <w:rFonts w:ascii="Aptos" w:hAnsi="Aptos"/>
-          <w:b/>
-          <w:i w:val="0"/>
-          <w:color w:val="000000"/>
-          <w:sz w:val="19"/>
-        </w:rPr>
-        <w:t xml:space="preserve">•  Describe owning something with no clear playbook.  </w:t>
-      </w:r>
-      <w:r>
-        <w:rPr>
-          <w:rFonts w:ascii="Aptos" w:hAnsi="Aptos"/>
-          <w:b w:val="0"/>
-          <w:i w:val="0"/>
-          <w:color w:val="2F75B5"/>
-          <w:sz w:val="19"/>
-        </w:rPr>
-        <w:t xml:space="preserve">→ Implementation / ambiguity story</w:t>
-      </w:r>
-    </w:p>
-    <w:p>
-      <w:pPr>
-        <w:spacing w:after="80"/>
-      </w:pPr>
-      <w:r>
-        <w:rPr>
-          <w:rFonts w:ascii="Aptos" w:hAnsi="Aptos"/>
-          <w:b/>
-          <w:i w:val="0"/>
-          <w:color w:val="000000"/>
-          <w:sz w:val="19"/>
-        </w:rPr>
-        <w:t xml:space="preserve">•  A time you drove adoption of something people resisted.  </w:t>
-      </w:r>
-      <w:r>
-        <w:rPr>
-          <w:rFonts w:ascii="Aptos" w:hAnsi="Aptos"/>
-          <w:b w:val="0"/>
-          <w:i w:val="0"/>
-          <w:color w:val="2F75B5"/>
-          <w:sz w:val="19"/>
-        </w:rPr>
-        <w:t xml:space="preserve">→ Adoption story</w:t>
-      </w:r>
-    </w:p>
-    <w:p>
-      <w:pPr>
-        <w:spacing w:after="80"/>
-      </w:pPr>
-      <w:r>
-        <w:rPr>
-          <w:rFonts w:ascii="Aptos" w:hAnsi="Aptos"/>
-          <w:b/>
-          <w:i w:val="0"/>
-          <w:color w:val="000000"/>
-          <w:sz w:val="19"/>
-        </w:rPr>
-        <w:t xml:space="preserve">•  When did you coordinate a release across teams?  </w:t>
-      </w:r>
-      <w:r>
-        <w:rPr>
-          <w:rFonts w:ascii="Aptos" w:hAnsi="Aptos"/>
-          <w:b w:val="0"/>
-          <w:i w:val="0"/>
-          <w:color w:val="2F75B5"/>
-          <w:sz w:val="19"/>
-        </w:rPr>
-        <w:t xml:space="preserve">→ Release coordination story</w:t>
-      </w:r>
-    </w:p>
-    <w:p>
-      <w:pPr>
-        <w:pStyle w:val="Heading3"/>
-      </w:pPr>
-      <w:r>
-        <w:rPr>
-          <w:rFonts w:ascii="Aptos" w:hAnsi="Aptos"/>
-          <w:b/>
-          <w:i w:val="0"/>
-          <w:color w:val="1F4E79"/>
-          <w:sz w:val="22"/>
-        </w:rPr>
-        <w:t xml:space="preserve">Conflict, pressure, and failure</w:t>
-      </w:r>
-    </w:p>
-    <w:p>
-      <w:pPr>
-        <w:spacing w:after="80"/>
-      </w:pPr>
-      <w:r>
-        <w:rPr>
-          <w:rFonts w:ascii="Aptos" w:hAnsi="Aptos"/>
-          <w:b/>
-          <w:i w:val="0"/>
-          <w:color w:val="000000"/>
-          <w:sz w:val="19"/>
-        </w:rPr>
-        <w:t xml:space="preserve">•  Tell me about a conflict with a stakeholder.  </w:t>
-      </w:r>
-      <w:r>
-        <w:rPr>
-          <w:rFonts w:ascii="Aptos" w:hAnsi="Aptos"/>
-          <w:b w:val="0"/>
-          <w:i w:val="0"/>
-          <w:color w:val="2F75B5"/>
-          <w:sz w:val="19"/>
-        </w:rPr>
-        <w:t xml:space="preserve">→ Opposing-stakeholders / conflict story</w:t>
-      </w:r>
-    </w:p>
-    <w:p>
-      <w:pPr>
-        <w:spacing w:after="80"/>
-      </w:pPr>
-      <w:r>
-        <w:rPr>
-          <w:rFonts w:ascii="Aptos" w:hAnsi="Aptos"/>
-          <w:b/>
-          <w:i w:val="0"/>
-          <w:color w:val="000000"/>
-          <w:sz w:val="19"/>
-        </w:rPr>
-        <w:t xml:space="preserve">•  A time you failed or a project went wrong.  </w:t>
-      </w:r>
-      <w:r>
-        <w:rPr>
-          <w:rFonts w:ascii="Aptos" w:hAnsi="Aptos"/>
-          <w:b w:val="0"/>
-          <w:i w:val="0"/>
-          <w:color w:val="2F75B5"/>
-          <w:sz w:val="19"/>
-        </w:rPr>
-        <w:t xml:space="preserve">→ Failure story (what you changed after)</w:t>
-      </w:r>
-    </w:p>
-    <w:p>
-      <w:pPr>
-        <w:spacing w:after="80"/>
-      </w:pPr>
-      <w:r>
-        <w:rPr>
-          <w:rFonts w:ascii="Aptos" w:hAnsi="Aptos"/>
-          <w:b/>
-          <w:i w:val="0"/>
-          <w:color w:val="000000"/>
-          <w:sz w:val="19"/>
-        </w:rPr>
-        <w:t xml:space="preserve">•  A high-pressure deadline you had to hit.  </w:t>
-      </w:r>
-      <w:r>
-        <w:rPr>
-          <w:rFonts w:ascii="Aptos" w:hAnsi="Aptos"/>
-          <w:b w:val="0"/>
-          <w:i w:val="0"/>
-          <w:color w:val="2F75B5"/>
-          <w:sz w:val="19"/>
-        </w:rPr>
-        <w:t xml:space="preserve">→ Delivery / scope-surprise story</w:t>
-      </w:r>
-    </w:p>
-    <w:p>
-      <w:pPr>
-        <w:spacing w:after="80"/>
-      </w:pPr>
-      <w:r>
-        <w:rPr>
-          <w:rFonts w:ascii="Aptos" w:hAnsi="Aptos"/>
-          <w:b/>
-          <w:i w:val="0"/>
-          <w:color w:val="000000"/>
-          <w:sz w:val="19"/>
-        </w:rPr>
-        <w:t xml:space="preserve">•  When did you have to say no or push back?  </w:t>
-      </w:r>
-      <w:r>
-        <w:rPr>
-          <w:rFonts w:ascii="Aptos" w:hAnsi="Aptos"/>
-          <w:b w:val="0"/>
-          <w:i w:val="0"/>
-          <w:color w:val="2F75B5"/>
-          <w:sz w:val="19"/>
-        </w:rPr>
-        <w:t xml:space="preserve">→ Prioritization / quality-judgment story</w:t>
-      </w:r>
-    </w:p>
-    <w:p>
-      <w:pPr>
-        <w:pStyle w:val="Heading3"/>
-      </w:pPr>
-      <w:r>
-        <w:rPr>
-          <w:rFonts w:ascii="Aptos" w:hAnsi="Aptos"/>
-          <w:b/>
-          <w:i w:val="0"/>
-          <w:color w:val="1F4E79"/>
-          <w:sz w:val="22"/>
-        </w:rPr>
-        <w:t xml:space="preserve">Impact and results</w:t>
-      </w:r>
-    </w:p>
-    <w:p>
-      <w:pPr>
-        <w:spacing w:after="80"/>
-      </w:pPr>
-      <w:r>
-        <w:rPr>
-          <w:rFonts w:ascii="Aptos" w:hAnsi="Aptos"/>
-          <w:b/>
-          <w:i w:val="0"/>
-          <w:color w:val="000000"/>
-          <w:sz w:val="19"/>
-        </w:rPr>
-        <w:t xml:space="preserve">•  Your biggest measurable business impact.  </w:t>
-      </w:r>
-      <w:r>
-        <w:rPr>
-          <w:rFonts w:ascii="Aptos" w:hAnsi="Aptos"/>
-          <w:b w:val="0"/>
-          <w:i w:val="0"/>
-          <w:color w:val="2F75B5"/>
-          <w:sz w:val="19"/>
-        </w:rPr>
-        <w:t xml:space="preserve">→ Churn recovery (about $1M at-risk revenue)</w:t>
-      </w:r>
-    </w:p>
-    <w:p>
-      <w:pPr>
-        <w:spacing w:after="80"/>
-      </w:pPr>
-      <w:r>
-        <w:rPr>
-          <w:rFonts w:ascii="Aptos" w:hAnsi="Aptos"/>
-          <w:b/>
-          <w:i w:val="0"/>
-          <w:color w:val="000000"/>
-          <w:sz w:val="19"/>
-        </w:rPr>
-        <w:t xml:space="preserve">•  A time data changed a decision.  </w:t>
-      </w:r>
-      <w:r>
-        <w:rPr>
-          <w:rFonts w:ascii="Aptos" w:hAnsi="Aptos"/>
-          <w:b w:val="0"/>
-          <w:i w:val="0"/>
-          <w:color w:val="2F75B5"/>
-          <w:sz w:val="19"/>
-        </w:rPr>
-        <w:t xml:space="preserve">→ Analytics / 200-plus dashboards story</w:t>
-      </w:r>
-    </w:p>
-    <w:p>
-      <w:pPr>
-        <w:spacing w:after="80"/>
-      </w:pPr>
-      <w:r>
-        <w:rPr>
-          <w:rFonts w:ascii="Aptos" w:hAnsi="Aptos"/>
-          <w:b/>
-          <w:i w:val="0"/>
-          <w:color w:val="000000"/>
-          <w:sz w:val="19"/>
-        </w:rPr>
-        <w:t xml:space="preserve">•  Persuading executives of something.  </w:t>
-      </w:r>
-      <w:r>
-        <w:rPr>
-          <w:rFonts w:ascii="Aptos" w:hAnsi="Aptos"/>
-          <w:b w:val="0"/>
-          <w:i w:val="0"/>
-          <w:color w:val="2F75B5"/>
-          <w:sz w:val="19"/>
-        </w:rPr>
-        <w:t xml:space="preserve">→ Executive persuasion / QBR story</w:t>
-      </w:r>
-    </w:p>
-    <w:p>
-      <w:pPr>
-        <w:spacing w:after="80"/>
-      </w:pPr>
-      <w:r>
-        <w:rPr>
-          <w:rFonts w:ascii="Aptos" w:hAnsi="Aptos"/>
-          <w:b/>
-          <w:i w:val="0"/>
-          <w:color w:val="000000"/>
-          <w:sz w:val="19"/>
-        </w:rPr>
-        <w:t xml:space="preserve">•  Working across cultures or regions.  </w:t>
-      </w:r>
-      <w:r>
-        <w:rPr>
-          <w:rFonts w:ascii="Aptos" w:hAnsi="Aptos"/>
-          <w:b w:val="0"/>
-          <w:i w:val="0"/>
-          <w:color w:val="2F75B5"/>
-          <w:sz w:val="19"/>
-        </w:rPr>
-        <w:t xml:space="preserve">→ Cross-cultural / Europe rollout story</w:t>
-      </w:r>
-    </w:p>
-    <w:p>
-      <w:pPr>
-        <w:spacing w:after="80"/>
-      </w:pPr>
-      <w:r>
-        <w:rPr>
-          <w:rFonts w:ascii="Aptos" w:hAnsi="Aptos"/>
-          <w:b w:val="0"/>
-          <w:i/>
-          <w:color w:val="5B6573"/>
-          <w:sz w:val="19"/>
-        </w:rPr>
-        <w:t xml:space="preserve">If a prompt does not map cleanly, default to your strongest lane opener, then bridge to the closest story. Never freeze searching for the perfect one.</w:t>
-      </w:r>
-    </w:p>
-    <w:p>
-      <w:pPr>
-        <w:pStyle w:val="Heading1"/>
-      </w:pPr>
-      <w:r>
-        <w:br w:type="page"/>
-      </w:r>
-      <w:r>
-        <w:rPr>
-          <w:rFonts w:ascii="Aptos" w:hAnsi="Aptos"/>
-          <w:b/>
-          <w:i w:val="0"/>
-          <w:color w:val="1F4E79"/>
-          <w:sz w:val="34"/>
-        </w:rPr>
-        <w:t xml:space="preserve">Part 4: Tough-question scripts</w:t>
-      </w:r>
-    </w:p>
-    <w:p>
-      <w:pPr>
-        <w:spacing w:after="80"/>
-      </w:pPr>
-      <w:r>
-        <w:rPr>
-          <w:rFonts w:ascii="Aptos" w:hAnsi="Aptos"/>
-          <w:b w:val="0"/>
-          <w:i/>
-          <w:color w:val="5B6573"/>
-          <w:sz w:val="19"/>
-        </w:rPr>
-        <w:t xml:space="preserve">Rehearse these to automatic. Meat first, no hedging, no volunteering more than asked. All true to your record.</w:t>
-      </w:r>
-    </w:p>
-    <w:p>
-      <w:pPr>
-        <w:pStyle w:val="Heading3"/>
-      </w:pPr>
-      <w:r>
-        <w:rPr>
-          <w:rFonts w:ascii="Aptos" w:hAnsi="Aptos"/>
-          <w:b/>
-          <w:i w:val="0"/>
-          <w:color w:val="1F4E79"/>
-          <w:sz w:val="22"/>
-        </w:rPr>
-        <w:t xml:space="preserve">Why did you leave your last role?</w:t>
-      </w:r>
-    </w:p>
-    <w:p>
-      <w:pPr>
-        <w:spacing w:after="80"/>
-      </w:pPr>
-      <w:r>
-        <w:rPr>
-          <w:rFonts w:ascii="Aptos" w:hAnsi="Aptos"/>
-          <w:b/>
-          <w:i w:val="0"/>
-          <w:color w:val="C55A11"/>
-          <w:sz w:val="19"/>
-        </w:rPr>
-        <w:t xml:space="preserve">Say:</w:t>
-      </w:r>
-    </w:p>
-    <w:p>
-      <w:pPr>
-        <w:spacing w:after="80"/>
-      </w:pPr>
-      <w:r>
-        <w:rPr>
-          <w:rFonts w:ascii="Aptos" w:hAnsi="Aptos"/>
-          <w:b w:val="0"/>
-          <w:i/>
-          <w:color w:val="3A2A55"/>
-          <w:sz w:val="19"/>
-        </w:rPr>
-        <w:t xml:space="preserve">My role at East West ended in a layoff after I completed the ERP migration and the project wound down. I am proud of what we delivered, and I am now looking for a place where I can keep doing that kind of end-to-end implementation work.</w:t>
-      </w:r>
-    </w:p>
-    <w:p>
-      <w:pPr>
-        <w:pStyle w:val="Heading3"/>
-      </w:pPr>
-      <w:r>
-        <w:rPr>
-          <w:rFonts w:ascii="Aptos" w:hAnsi="Aptos"/>
-          <w:b/>
-          <w:i w:val="0"/>
-          <w:color w:val="1F4E79"/>
-          <w:sz w:val="22"/>
-        </w:rPr>
-        <w:t xml:space="preserve">What is your greatest weakness?</w:t>
-      </w:r>
-    </w:p>
-    <w:p>
-      <w:pPr>
-        <w:spacing w:after="80"/>
-      </w:pPr>
-      <w:r>
-        <w:rPr>
-          <w:rFonts w:ascii="Aptos" w:hAnsi="Aptos"/>
-          <w:b/>
-          <w:i w:val="0"/>
-          <w:color w:val="C55A11"/>
-          <w:sz w:val="19"/>
-        </w:rPr>
-        <w:t xml:space="preserve">Say:</w:t>
-      </w:r>
-    </w:p>
-    <w:p>
-      <w:pPr>
-        <w:spacing w:after="80"/>
-      </w:pPr>
-      <w:r>
-        <w:rPr>
-          <w:rFonts w:ascii="Aptos" w:hAnsi="Aptos"/>
-          <w:b w:val="0"/>
-          <w:i/>
-          <w:color w:val="3A2A55"/>
-          <w:sz w:val="19"/>
-        </w:rPr>
-        <w:t xml:space="preserve">I used to over-index on getting every detail perfect before I would show work. I have learned to share a structured draft early and let feedback shape it, which moves projects faster and keeps stakeholders aligned.</w:t>
-      </w:r>
-    </w:p>
-    <w:p>
-      <w:pPr>
-        <w:pStyle w:val="Heading3"/>
-      </w:pPr>
-      <w:r>
-        <w:rPr>
-          <w:rFonts w:ascii="Aptos" w:hAnsi="Aptos"/>
-          <w:b/>
-          <w:i w:val="0"/>
-          <w:color w:val="1F4E79"/>
-          <w:sz w:val="22"/>
-        </w:rPr>
-        <w:t xml:space="preserve">There is a gap on your resume. What happened?</w:t>
-      </w:r>
-    </w:p>
-    <w:p>
-      <w:pPr>
-        <w:spacing w:after="80"/>
-      </w:pPr>
-      <w:r>
-        <w:rPr>
-          <w:rFonts w:ascii="Aptos" w:hAnsi="Aptos"/>
-          <w:b/>
-          <w:i w:val="0"/>
-          <w:color w:val="C55A11"/>
-          <w:sz w:val="19"/>
-        </w:rPr>
-        <w:t xml:space="preserve">Say:</w:t>
-      </w:r>
-    </w:p>
-    <w:p>
-      <w:pPr>
-        <w:spacing w:after="80"/>
-      </w:pPr>
-      <w:r>
-        <w:rPr>
-          <w:rFonts w:ascii="Aptos" w:hAnsi="Aptos"/>
-          <w:b w:val="0"/>
-          <w:i/>
-          <w:color w:val="3A2A55"/>
-          <w:sz w:val="19"/>
-        </w:rPr>
-        <w:t xml:space="preserve">I used the time deliberately to deepen the technical side of my work, SQL, cloud, security, and applied AI, so I can bridge business and build even better. I have been consistent about it, and I can show you what I have been studying.</w:t>
-      </w:r>
-    </w:p>
-    <w:p>
-      <w:pPr>
-        <w:pStyle w:val="Heading3"/>
-      </w:pPr>
-      <w:r>
-        <w:rPr>
-          <w:rFonts w:ascii="Aptos" w:hAnsi="Aptos"/>
-          <w:b/>
-          <w:i w:val="0"/>
-          <w:color w:val="1F4E79"/>
-          <w:sz w:val="22"/>
-        </w:rPr>
-        <w:t xml:space="preserve">What are your salary expectations?</w:t>
-      </w:r>
-    </w:p>
-    <w:p>
-      <w:pPr>
-        <w:spacing w:after="80"/>
-      </w:pPr>
-      <w:r>
-        <w:rPr>
-          <w:rFonts w:ascii="Aptos" w:hAnsi="Aptos"/>
-          <w:b/>
-          <w:i w:val="0"/>
-          <w:color w:val="C55A11"/>
-          <w:sz w:val="19"/>
-        </w:rPr>
-        <w:t xml:space="preserve">Say:</w:t>
-      </w:r>
-    </w:p>
-    <w:p>
-      <w:pPr>
-        <w:spacing w:after="80"/>
-      </w:pPr>
-      <w:r>
-        <w:rPr>
-          <w:rFonts w:ascii="Aptos" w:hAnsi="Aptos"/>
-          <w:b w:val="0"/>
-          <w:i/>
-          <w:color w:val="3A2A55"/>
-          <w:sz w:val="19"/>
-        </w:rPr>
-        <w:t xml:space="preserve">I am focused on finding the right fit and I am flexible for the right role. What range has this position been budgeted for? Based on my research for this kind of role in Atlanta, I am targeting my anchor range, and I am open to the full package.</w:t>
-      </w:r>
-    </w:p>
-    <w:p>
-      <w:pPr>
-        <w:pStyle w:val="Heading3"/>
-      </w:pPr>
-      <w:r>
-        <w:rPr>
-          <w:rFonts w:ascii="Aptos" w:hAnsi="Aptos"/>
-          <w:b/>
-          <w:i w:val="0"/>
-          <w:color w:val="1F4E79"/>
-          <w:sz w:val="22"/>
-        </w:rPr>
-        <w:t xml:space="preserve">Why should we hire you? / Why this role?</w:t>
-      </w:r>
-    </w:p>
-    <w:p>
-      <w:pPr>
-        <w:spacing w:after="80"/>
-      </w:pPr>
-      <w:r>
-        <w:rPr>
-          <w:rFonts w:ascii="Aptos" w:hAnsi="Aptos"/>
-          <w:b/>
-          <w:i w:val="0"/>
-          <w:color w:val="C55A11"/>
-          <w:sz w:val="19"/>
-        </w:rPr>
-        <w:t xml:space="preserve">Say:</w:t>
-      </w:r>
-    </w:p>
-    <w:p>
-      <w:pPr>
-        <w:spacing w:after="80"/>
-      </w:pPr>
-      <w:r>
-        <w:rPr>
-          <w:rFonts w:ascii="Aptos" w:hAnsi="Aptos"/>
-          <w:b w:val="0"/>
-          <w:i/>
-          <w:color w:val="3A2A55"/>
-          <w:sz w:val="19"/>
-        </w:rPr>
-        <w:t xml:space="preserve">I have delivered this kind of enterprise software from both sides, vendor and customer, so I understand the whole lifecycle and where adoption breaks. That is exactly the problem this role is solving, and it is the work I do best.</w:t>
-      </w:r>
-    </w:p>
-    <w:p>
-      <w:pPr>
-        <w:pStyle w:val="Heading3"/>
-      </w:pPr>
-      <w:r>
-        <w:rPr>
-          <w:rFonts w:ascii="Aptos" w:hAnsi="Aptos"/>
-          <w:b/>
-          <w:i w:val="0"/>
-          <w:color w:val="1F4E79"/>
-          <w:sz w:val="22"/>
-        </w:rPr>
-        <w:t xml:space="preserve">What is your greatest strength?</w:t>
-      </w:r>
-    </w:p>
-    <w:p>
-      <w:pPr>
-        <w:spacing w:after="80"/>
-      </w:pPr>
-      <w:r>
-        <w:rPr>
-          <w:rFonts w:ascii="Aptos" w:hAnsi="Aptos"/>
-          <w:b/>
-          <w:i w:val="0"/>
-          <w:color w:val="C55A11"/>
-          <w:sz w:val="19"/>
-        </w:rPr>
-        <w:t xml:space="preserve">Say:</w:t>
-      </w:r>
-    </w:p>
-    <w:p>
-      <w:pPr>
-        <w:spacing w:after="80"/>
-      </w:pPr>
-      <w:r>
-        <w:rPr>
-          <w:rFonts w:ascii="Aptos" w:hAnsi="Aptos"/>
-          <w:b w:val="0"/>
-          <w:i/>
-          <w:color w:val="3A2A55"/>
-          <w:sz w:val="19"/>
-        </w:rPr>
-        <w:t xml:space="preserve">Turning ambiguous, cross-functional problems into structured delivery that actually gets adopted. I work best at the intersection of business, operations, and technology, where most initiatives stall.</w:t>
-      </w:r>
-    </w:p>
-    <w:p>
-      <w:pPr>
-        <w:pStyle w:val="Heading1"/>
-      </w:pPr>
-      <w:r>
-        <w:br w:type="page"/>
-      </w:r>
-      <w:r>
-        <w:rPr>
-          <w:rFonts w:ascii="Aptos" w:hAnsi="Aptos"/>
-          <w:b/>
-          <w:i w:val="0"/>
-          <w:color w:val="1F4E79"/>
-          <w:sz w:val="34"/>
-        </w:rPr>
-        <w:t xml:space="preserve">Part 5: Opening and closing scripts</w:t>
-      </w:r>
-    </w:p>
-    <w:p>
-      <w:pPr>
-        <w:pStyle w:val="Heading3"/>
-      </w:pPr>
-      <w:r>
-        <w:rPr>
-          <w:rFonts w:ascii="Aptos" w:hAnsi="Aptos"/>
-          <w:b/>
-          <w:i w:val="0"/>
-          <w:color w:val="1F4E79"/>
-          <w:sz w:val="22"/>
-        </w:rPr>
-        <w:t xml:space="preserve">Tell me about yourself (the 60 to 90 second version)</w:t>
-      </w:r>
-    </w:p>
-    <w:p>
-      <w:pPr>
-        <w:spacing w:after="80"/>
-      </w:pPr>
-      <w:r>
-        <w:rPr>
-          <w:rFonts w:ascii="Aptos" w:hAnsi="Aptos"/>
-          <w:b/>
-          <w:i w:val="0"/>
-          <w:color w:val="C55A11"/>
-          <w:sz w:val="19"/>
-        </w:rPr>
-        <w:t xml:space="preserve">Say:</w:t>
-      </w:r>
-    </w:p>
-    <w:p>
-      <w:pPr>
-        <w:spacing w:after="80"/>
-      </w:pPr>
-      <w:r>
-        <w:rPr>
-          <w:rFonts w:ascii="Aptos" w:hAnsi="Aptos"/>
-          <w:b w:val="0"/>
-          <w:i/>
-          <w:color w:val="3A2A55"/>
-          <w:sz w:val="19"/>
-        </w:rPr>
-        <w:t xml:space="preserve">I take on ambiguous, cross-functional work and turn it into structured delivery that gets adopted. I have owned that from both the vendor side at Aptean, where I implemented and supported 80-plus clients, and the customer side at East West, where I led an end-to-end ERP migration across five sites. My best work is at the intersection of business, operations, and technology, and I am now deepening SQL, cloud, and applied AI so I can bridge the business and the build even better. That is why this role caught my attention.</w:t>
-      </w:r>
-    </w:p>
-    <w:p>
-      <w:pPr>
-        <w:pStyle w:val="Heading3"/>
-      </w:pPr>
-      <w:r>
-        <w:rPr>
-          <w:rFonts w:ascii="Aptos" w:hAnsi="Aptos"/>
-          <w:b/>
-          <w:i w:val="0"/>
-          <w:color w:val="1F4E79"/>
-          <w:sz w:val="22"/>
-        </w:rPr>
-        <w:t xml:space="preserve">Strong close (when they ask if you have anything to add)</w:t>
-      </w:r>
-    </w:p>
-    <w:p>
-      <w:pPr>
-        <w:spacing w:after="80"/>
-      </w:pPr>
-      <w:r>
-        <w:rPr>
-          <w:rFonts w:ascii="Aptos" w:hAnsi="Aptos"/>
-          <w:b/>
-          <w:i w:val="0"/>
-          <w:color w:val="C55A11"/>
-          <w:sz w:val="19"/>
-        </w:rPr>
-        <w:t xml:space="preserve">Say:</w:t>
-      </w:r>
-    </w:p>
-    <w:p>
-      <w:pPr>
-        <w:spacing w:after="80"/>
-      </w:pPr>
-      <w:r>
-        <w:rPr>
-          <w:rFonts w:ascii="Aptos" w:hAnsi="Aptos"/>
-          <w:b w:val="0"/>
-          <w:i/>
-          <w:color w:val="3A2A55"/>
-          <w:sz w:val="19"/>
-        </w:rPr>
-        <w:t xml:space="preserve">I want to be direct: this is exactly the kind of delivery-and-adoption problem I do best, from both sides of the table. I am confident I can ramp fast and add value early. What are the next steps?</w:t>
-      </w:r>
-    </w:p>
-    <w:p>
-      <w:pPr>
-        <w:pStyle w:val="Heading3"/>
-      </w:pPr>
-      <w:r>
-        <w:rPr>
-          <w:rFonts w:ascii="Aptos" w:hAnsi="Aptos"/>
-          <w:b/>
-          <w:i w:val="0"/>
-          <w:color w:val="1F4E79"/>
-          <w:sz w:val="22"/>
-        </w:rPr>
-        <w:t xml:space="preserve">Questions to ask them (pick two or three)</w:t>
-      </w:r>
-    </w:p>
-    <w:p>
-      <w:pPr>
-        <w:spacing w:after="80"/>
-      </w:pPr>
-      <w:r>
-        <w:rPr>
-          <w:rFonts w:ascii="Aptos" w:hAnsi="Aptos"/>
-          <w:b/>
-          <w:i w:val="0"/>
-          <w:color w:val="000000"/>
-          <w:sz w:val="19"/>
-        </w:rPr>
-        <w:t xml:space="preserve">•  What does success look like in the first 90 days?</w:t>
-      </w:r>
-    </w:p>
-    <w:p>
-      <w:pPr>
-        <w:spacing w:after="80"/>
-      </w:pPr>
-      <w:r>
-        <w:rPr>
-          <w:rFonts w:ascii="Aptos" w:hAnsi="Aptos"/>
-          <w:b/>
-          <w:i w:val="0"/>
-          <w:color w:val="000000"/>
-          <w:sz w:val="19"/>
-        </w:rPr>
-        <w:t xml:space="preserve">•  What is the manager's style, and how are decisions and changes explained here?</w:t>
-      </w:r>
-    </w:p>
-    <w:p>
-      <w:pPr>
-        <w:spacing w:after="80"/>
-      </w:pPr>
-      <w:r>
-        <w:rPr>
-          <w:rFonts w:ascii="Aptos" w:hAnsi="Aptos"/>
-          <w:b/>
-          <w:i w:val="0"/>
-          <w:color w:val="000000"/>
-          <w:sz w:val="19"/>
-        </w:rPr>
-        <w:t xml:space="preserve">•  Where do implementations or projects most often stall on this team?</w:t>
-      </w:r>
-    </w:p>
-    <w:p>
-      <w:pPr>
-        <w:spacing w:after="80"/>
-      </w:pPr>
-      <w:r>
-        <w:rPr>
-          <w:rFonts w:ascii="Aptos" w:hAnsi="Aptos"/>
-          <w:b/>
-          <w:i w:val="0"/>
-          <w:color w:val="000000"/>
-          <w:sz w:val="19"/>
-        </w:rPr>
-        <w:t xml:space="preserve">•  How much autonomy does this role have to improve the process?</w:t>
-      </w:r>
-    </w:p>
-    <w:p>
-      <w:pPr>
-        <w:spacing w:after="80"/>
-      </w:pPr>
-      <w:r>
-        <w:rPr>
-          <w:rFonts w:ascii="Aptos" w:hAnsi="Aptos"/>
-          <w:b w:val="0"/>
-          <w:i/>
-          <w:color w:val="5B6573"/>
-          <w:sz w:val="19"/>
-        </w:rPr>
-        <w:t xml:space="preserve">The management-style and why-driven questions are for you: you thrive with managers who explain the why.</w:t>
-      </w:r>
-    </w:p>
-    <w:p>
-      <w:pPr>
-        <w:pStyle w:val="Heading1"/>
-      </w:pPr>
-      <w:r>
-        <w:br w:type="page"/>
-      </w:r>
-      <w:r>
-        <w:rPr>
-          <w:rFonts w:ascii="Aptos" w:hAnsi="Aptos"/>
-          <w:b/>
-          <w:i w:val="0"/>
-          <w:color w:val="1F4E79"/>
-          <w:sz w:val="34"/>
-        </w:rPr>
-        <w:t xml:space="preserve">Part 6: Morning-of checklist</w:t>
-      </w:r>
-    </w:p>
-    <w:p>
-      <w:pPr>
-        <w:spacing w:after="80"/>
-      </w:pPr>
-      <w:r>
-        <w:rPr>
-          <w:rFonts w:ascii="Aptos" w:hAnsi="Aptos"/>
-          <w:b/>
-          <w:i w:val="0"/>
-          <w:color w:val="000000"/>
-          <w:sz w:val="19"/>
-        </w:rPr>
-        <w:t xml:space="preserve">•  Regulate. </w:t>
-      </w:r>
-      <w:r>
-        <w:rPr>
-          <w:rFonts w:ascii="Aptos" w:hAnsi="Aptos"/>
-          <w:b w:val="0"/>
-          <w:i w:val="0"/>
-          <w:color w:val="000000"/>
-          <w:sz w:val="19"/>
-        </w:rPr>
-        <w:t xml:space="preserve">Three slow belly breaths, feet on the floor. Say the Purpose anchor once.</w:t>
-      </w:r>
-    </w:p>
-    <w:p>
-      <w:pPr>
-        <w:spacing w:after="80"/>
-      </w:pPr>
-      <w:r>
-        <w:rPr>
-          <w:rFonts w:ascii="Aptos" w:hAnsi="Aptos"/>
-          <w:b/>
-          <w:i w:val="0"/>
-          <w:color w:val="000000"/>
-          <w:sz w:val="19"/>
-        </w:rPr>
-        <w:t xml:space="preserve">•  Rehearse only the 30-second anchor. </w:t>
-      </w:r>
-      <w:r>
-        <w:rPr>
-          <w:rFonts w:ascii="Aptos" w:hAnsi="Aptos"/>
-          <w:b w:val="0"/>
-          <w:i w:val="0"/>
-          <w:color w:val="000000"/>
-          <w:sz w:val="19"/>
-        </w:rPr>
-        <w:t xml:space="preserve">Not the whole bank. One clean rep, out loud, standing.</w:t>
-      </w:r>
-    </w:p>
-    <w:p>
-      <w:pPr>
-        <w:spacing w:after="80"/>
-      </w:pPr>
-      <w:r>
-        <w:rPr>
-          <w:rFonts w:ascii="Aptos" w:hAnsi="Aptos"/>
-          <w:b/>
-          <w:i w:val="0"/>
-          <w:color w:val="000000"/>
-          <w:sz w:val="19"/>
-        </w:rPr>
-        <w:t xml:space="preserve">•  Read your Evidence Log once. </w:t>
-      </w:r>
-      <w:r>
-        <w:rPr>
-          <w:rFonts w:ascii="Aptos" w:hAnsi="Aptos"/>
-          <w:b w:val="0"/>
-          <w:i w:val="0"/>
-          <w:color w:val="000000"/>
-          <w:sz w:val="19"/>
-        </w:rPr>
-        <w:t xml:space="preserve">Let the wins be fresh; do not re-study.</w:t>
-      </w:r>
-    </w:p>
-    <w:p>
-      <w:pPr>
-        <w:spacing w:after="80"/>
-      </w:pPr>
-      <w:r>
-        <w:rPr>
-          <w:rFonts w:ascii="Aptos" w:hAnsi="Aptos"/>
-          <w:b/>
-          <w:i w:val="0"/>
-          <w:color w:val="000000"/>
-          <w:sz w:val="19"/>
-        </w:rPr>
-        <w:t xml:space="preserve">•  Skim the four lane openers. </w:t>
-      </w:r>
-      <w:r>
-        <w:rPr>
-          <w:rFonts w:ascii="Aptos" w:hAnsi="Aptos"/>
-          <w:b w:val="0"/>
-          <w:i w:val="0"/>
-          <w:color w:val="000000"/>
-          <w:sz w:val="19"/>
-        </w:rPr>
-        <w:t xml:space="preserve">Know your exact first sentence for this role.</w:t>
-      </w:r>
-    </w:p>
-    <w:p>
-      <w:pPr>
-        <w:spacing w:after="80"/>
-      </w:pPr>
-      <w:r>
-        <w:rPr>
-          <w:rFonts w:ascii="Aptos" w:hAnsi="Aptos"/>
-          <w:b/>
-          <w:i w:val="0"/>
-          <w:color w:val="000000"/>
-          <w:sz w:val="19"/>
-        </w:rPr>
-        <w:t xml:space="preserve">•  Expect the spike. </w:t>
-      </w:r>
-      <w:r>
-        <w:rPr>
-          <w:rFonts w:ascii="Aptos" w:hAnsi="Aptos"/>
-          <w:b w:val="0"/>
-          <w:i w:val="0"/>
-          <w:color w:val="000000"/>
-          <w:sz w:val="19"/>
-        </w:rPr>
-        <w:t xml:space="preserve">The pre-performance adrenaline means it is working, not failing.</w:t>
-      </w:r>
-    </w:p>
-    <w:p>
-      <w:pPr>
-        <w:spacing w:after="80"/>
-      </w:pPr>
-      <w:r>
-        <w:rPr>
-          <w:rFonts w:ascii="Aptos" w:hAnsi="Aptos"/>
-          <w:b/>
-          <w:i w:val="0"/>
-          <w:color w:val="000000"/>
-          <w:sz w:val="19"/>
-        </w:rPr>
-        <w:t xml:space="preserve">•  Set up the space. </w:t>
-      </w:r>
-      <w:r>
-        <w:rPr>
-          <w:rFonts w:ascii="Aptos" w:hAnsi="Aptos"/>
-          <w:b w:val="0"/>
-          <w:i w:val="0"/>
-          <w:color w:val="000000"/>
-          <w:sz w:val="19"/>
-        </w:rPr>
-        <w:t xml:space="preserve">Reduce glare and noise, water nearby, camera at eye level if remote.</w:t>
-      </w:r>
-    </w:p>
-    <w:p>
-      <w:pPr>
-        <w:spacing w:after="80"/>
-      </w:pPr>
-      <w:r>
-        <w:rPr>
-          <w:rFonts w:ascii="Aptos" w:hAnsi="Aptos"/>
-          <w:b/>
-          <w:i w:val="0"/>
-          <w:color w:val="000000"/>
-          <w:sz w:val="19"/>
-        </w:rPr>
-        <w:t xml:space="preserve">•  One line to carry in: </w:t>
-      </w:r>
-      <w:r>
-        <w:rPr>
-          <w:rFonts w:ascii="Aptos" w:hAnsi="Aptos"/>
-          <w:b w:val="0"/>
-          <w:i w:val="0"/>
-          <w:color w:val="000000"/>
-          <w:sz w:val="19"/>
-        </w:rPr>
-        <w:t xml:space="preserve">"I am not selling myself. I am diagnosing their problem."</w:t>
       </w:r>
     </w:p>
     <w:sectPr>

</xml_diff>